<commit_message>
Added clarification for  data set section
</commit_message>
<xml_diff>
--- a/Project Proposal.docx
+++ b/Project Proposal.docx
@@ -262,6 +262,66 @@
           <w:szCs w:val="24"/>
         </w:rPr>
         <w:t>We'll use approximately 15,000 frames with semantic segmentation annotations (a substantial subset of the full dataset)</w:t>
+      </w:r>
+      <w:r>
+        <w:rPr>
+          <w:rFonts w:ascii="Times New Roman" w:hAnsi="Times New Roman" w:cs="Times New Roman"/>
+          <w:sz w:val="24"/>
+          <w:szCs w:val="24"/>
+        </w:rPr>
+        <w:t xml:space="preserve">. </w:t>
+      </w:r>
+      <w:r>
+        <w:rPr>
+          <w:rFonts w:ascii="Times New Roman" w:hAnsi="Times New Roman" w:cs="Times New Roman"/>
+          <w:sz w:val="24"/>
+          <w:szCs w:val="24"/>
+        </w:rPr>
+        <w:t>This subset is sufficient for training a DeepLabV3+ model, especially with:</w:t>
+      </w:r>
+    </w:p>
+    <w:p>
+      <w:pPr>
+        <w:numPr>
+          <w:ilvl w:val="1"/>
+          <w:numId w:val="11"/>
+        </w:numPr>
+        <w:jc w:val="both"/>
+        <w:rPr>
+          <w:rFonts w:ascii="Times New Roman" w:hAnsi="Times New Roman" w:cs="Times New Roman"/>
+          <w:sz w:val="24"/>
+          <w:szCs w:val="24"/>
+        </w:rPr>
+      </w:pPr>
+      <w:r>
+        <w:rPr>
+          <w:rFonts w:ascii="Times New Roman" w:hAnsi="Times New Roman" w:cs="Times New Roman"/>
+          <w:sz w:val="24"/>
+          <w:szCs w:val="24"/>
+        </w:rPr>
+        <w:t>Data augmentation (flipping, cropping, scaling)</w:t>
+      </w:r>
+    </w:p>
+    <w:p>
+      <w:pPr>
+        <w:numPr>
+          <w:ilvl w:val="1"/>
+          <w:numId w:val="11"/>
+        </w:numPr>
+        <w:jc w:val="both"/>
+        <w:rPr>
+          <w:rFonts w:ascii="Times New Roman" w:hAnsi="Times New Roman" w:cs="Times New Roman"/>
+          <w:sz w:val="24"/>
+          <w:szCs w:val="24"/>
+        </w:rPr>
+      </w:pPr>
+      <w:r>
+        <w:rPr>
+          <w:rFonts w:ascii="Times New Roman" w:hAnsi="Times New Roman" w:cs="Times New Roman"/>
+          <w:sz w:val="24"/>
+          <w:szCs w:val="24"/>
+        </w:rPr>
+        <w:t>Transfer learning (e.g., using a pretrained ResNet-50 backbone)</w:t>
       </w:r>
     </w:p>
     <w:p>
@@ -1060,7 +1120,7 @@
         <w:sz w:val="20"/>
       </w:rPr>
     </w:lvl>
-    <w:lvl w:ilvl="1" w:tentative="1">
+    <w:lvl w:ilvl="1">
       <w:start w:val="1"/>
       <w:numFmt w:val="bullet"/>
       <w:lvlText w:val="o"/>
@@ -2093,6 +2153,151 @@
     </w:lvl>
   </w:abstractNum>
   <w:abstractNum w:abstractNumId="8" w15:restartNumberingAfterBreak="0">
+    <w:nsid w:val="68C47029"/>
+    <w:multiLevelType w:val="multilevel"/>
+    <w:tmpl w:val="BC2A10FE"/>
+    <w:lvl w:ilvl="0">
+      <w:start w:val="1"/>
+      <w:numFmt w:val="bullet"/>
+      <w:lvlText w:val=""/>
+      <w:lvlJc w:val="left"/>
+      <w:pPr>
+        <w:tabs>
+          <w:tab w:val="num" w:pos="720"/>
+        </w:tabs>
+        <w:ind w:left="720" w:hanging="360"/>
+      </w:pPr>
+      <w:rPr>
+        <w:rFonts w:ascii="Symbol" w:hAnsi="Symbol" w:hint="default"/>
+        <w:sz w:val="20"/>
+      </w:rPr>
+    </w:lvl>
+    <w:lvl w:ilvl="1">
+      <w:start w:val="1"/>
+      <w:numFmt w:val="bullet"/>
+      <w:lvlText w:val=""/>
+      <w:lvlJc w:val="left"/>
+      <w:pPr>
+        <w:ind w:left="1440" w:hanging="360"/>
+      </w:pPr>
+      <w:rPr>
+        <w:rFonts w:ascii="Wingdings" w:hAnsi="Wingdings" w:hint="default"/>
+      </w:rPr>
+    </w:lvl>
+    <w:lvl w:ilvl="2" w:tentative="1">
+      <w:start w:val="1"/>
+      <w:numFmt w:val="bullet"/>
+      <w:lvlText w:val=""/>
+      <w:lvlJc w:val="left"/>
+      <w:pPr>
+        <w:tabs>
+          <w:tab w:val="num" w:pos="2160"/>
+        </w:tabs>
+        <w:ind w:left="2160" w:hanging="360"/>
+      </w:pPr>
+      <w:rPr>
+        <w:rFonts w:ascii="Wingdings" w:hAnsi="Wingdings" w:hint="default"/>
+        <w:sz w:val="20"/>
+      </w:rPr>
+    </w:lvl>
+    <w:lvl w:ilvl="3" w:tentative="1">
+      <w:start w:val="1"/>
+      <w:numFmt w:val="bullet"/>
+      <w:lvlText w:val=""/>
+      <w:lvlJc w:val="left"/>
+      <w:pPr>
+        <w:tabs>
+          <w:tab w:val="num" w:pos="2880"/>
+        </w:tabs>
+        <w:ind w:left="2880" w:hanging="360"/>
+      </w:pPr>
+      <w:rPr>
+        <w:rFonts w:ascii="Wingdings" w:hAnsi="Wingdings" w:hint="default"/>
+        <w:sz w:val="20"/>
+      </w:rPr>
+    </w:lvl>
+    <w:lvl w:ilvl="4" w:tentative="1">
+      <w:start w:val="1"/>
+      <w:numFmt w:val="bullet"/>
+      <w:lvlText w:val=""/>
+      <w:lvlJc w:val="left"/>
+      <w:pPr>
+        <w:tabs>
+          <w:tab w:val="num" w:pos="3600"/>
+        </w:tabs>
+        <w:ind w:left="3600" w:hanging="360"/>
+      </w:pPr>
+      <w:rPr>
+        <w:rFonts w:ascii="Wingdings" w:hAnsi="Wingdings" w:hint="default"/>
+        <w:sz w:val="20"/>
+      </w:rPr>
+    </w:lvl>
+    <w:lvl w:ilvl="5" w:tentative="1">
+      <w:start w:val="1"/>
+      <w:numFmt w:val="bullet"/>
+      <w:lvlText w:val=""/>
+      <w:lvlJc w:val="left"/>
+      <w:pPr>
+        <w:tabs>
+          <w:tab w:val="num" w:pos="4320"/>
+        </w:tabs>
+        <w:ind w:left="4320" w:hanging="360"/>
+      </w:pPr>
+      <w:rPr>
+        <w:rFonts w:ascii="Wingdings" w:hAnsi="Wingdings" w:hint="default"/>
+        <w:sz w:val="20"/>
+      </w:rPr>
+    </w:lvl>
+    <w:lvl w:ilvl="6" w:tentative="1">
+      <w:start w:val="1"/>
+      <w:numFmt w:val="bullet"/>
+      <w:lvlText w:val=""/>
+      <w:lvlJc w:val="left"/>
+      <w:pPr>
+        <w:tabs>
+          <w:tab w:val="num" w:pos="5040"/>
+        </w:tabs>
+        <w:ind w:left="5040" w:hanging="360"/>
+      </w:pPr>
+      <w:rPr>
+        <w:rFonts w:ascii="Wingdings" w:hAnsi="Wingdings" w:hint="default"/>
+        <w:sz w:val="20"/>
+      </w:rPr>
+    </w:lvl>
+    <w:lvl w:ilvl="7" w:tentative="1">
+      <w:start w:val="1"/>
+      <w:numFmt w:val="bullet"/>
+      <w:lvlText w:val=""/>
+      <w:lvlJc w:val="left"/>
+      <w:pPr>
+        <w:tabs>
+          <w:tab w:val="num" w:pos="5760"/>
+        </w:tabs>
+        <w:ind w:left="5760" w:hanging="360"/>
+      </w:pPr>
+      <w:rPr>
+        <w:rFonts w:ascii="Wingdings" w:hAnsi="Wingdings" w:hint="default"/>
+        <w:sz w:val="20"/>
+      </w:rPr>
+    </w:lvl>
+    <w:lvl w:ilvl="8" w:tentative="1">
+      <w:start w:val="1"/>
+      <w:numFmt w:val="bullet"/>
+      <w:lvlText w:val=""/>
+      <w:lvlJc w:val="left"/>
+      <w:pPr>
+        <w:tabs>
+          <w:tab w:val="num" w:pos="6480"/>
+        </w:tabs>
+        <w:ind w:left="6480" w:hanging="360"/>
+      </w:pPr>
+      <w:rPr>
+        <w:rFonts w:ascii="Wingdings" w:hAnsi="Wingdings" w:hint="default"/>
+        <w:sz w:val="20"/>
+      </w:rPr>
+    </w:lvl>
+  </w:abstractNum>
+  <w:abstractNum w:abstractNumId="9" w15:restartNumberingAfterBreak="0">
     <w:nsid w:val="701116EC"/>
     <w:multiLevelType w:val="multilevel"/>
     <w:tmpl w:val="39EEB764"/>
@@ -2241,7 +2446,7 @@
       </w:rPr>
     </w:lvl>
   </w:abstractNum>
-  <w:abstractNum w:abstractNumId="9" w15:restartNumberingAfterBreak="0">
+  <w:abstractNum w:abstractNumId="10" w15:restartNumberingAfterBreak="0">
     <w:nsid w:val="75AA40C8"/>
     <w:multiLevelType w:val="multilevel"/>
     <w:tmpl w:val="0AF81B16"/>
@@ -2361,10 +2566,10 @@
     <w:abstractNumId w:val="0"/>
   </w:num>
   <w:num w:numId="3" w16cid:durableId="255675026">
-    <w:abstractNumId w:val="8"/>
+    <w:abstractNumId w:val="9"/>
   </w:num>
   <w:num w:numId="4" w16cid:durableId="805506240">
-    <w:abstractNumId w:val="9"/>
+    <w:abstractNumId w:val="10"/>
   </w:num>
   <w:num w:numId="5" w16cid:durableId="1466000012">
     <w:abstractNumId w:val="6"/>
@@ -2383,6 +2588,9 @@
   </w:num>
   <w:num w:numId="10" w16cid:durableId="1640457581">
     <w:abstractNumId w:val="5"/>
+  </w:num>
+  <w:num w:numId="11" w16cid:durableId="792947924">
+    <w:abstractNumId w:val="8"/>
   </w:num>
 </w:numbering>
 </file>

</xml_diff>